<commit_message>
docs: update v0.23 whitepaper literature guide
</commit_message>
<xml_diff>
--- a/docs/PsyClaw使用白皮书_v0.23.0.docx
+++ b/docs/PsyClaw使用白皮书_v0.23.0.docx
@@ -2939,6 +2939,625 @@
                 <w:sz w:val="19"/>
               </w:rPr>
               <w:t>「查无此文」与「无法查证」为两类不同结果,后者不会误判未被收录的中文文献。</w:t>
+            </w:r>
+          </w:p>
+        </w:tc>
+      </w:tr>
+    </w:tbl>
+    <w:p>
+      <w:pPr>
+        <w:spacing w:after="80"/>
+      </w:pPr>
+    </w:p>
+    <w:p>
+      <w:pPr>
+        <w:pStyle w:val="Heading2"/>
+        <w:spacing w:before="240" w:after="160"/>
+      </w:pPr>
+      <w:r>
+        <w:rPr>
+          <w:rFonts w:ascii="Arial Unicode MS" w:hAnsi="Arial Unicode MS" w:eastAsia="Arial Unicode MS" w:cs="Arial Unicode MS" w:hint="eastAsia"/>
+          <w:b/>
+          <w:color w:val="1A1A1A"/>
+          <w:sz w:val="28"/>
+        </w:rPr>
+        <w:t>2.4　从主题到可复查的检索计划</w:t>
+      </w:r>
+    </w:p>
+    <w:p>
+      <w:pPr>
+        <w:spacing w:after="120" w:line="360" w:lineRule="auto"/>
+      </w:pPr>
+      <w:r>
+        <w:rPr>
+          <w:rFonts w:ascii="Arial Unicode MS" w:hAnsi="Arial Unicode MS" w:eastAsia="Arial Unicode MS" w:cs="Arial Unicode MS" w:hint="eastAsia"/>
+          <w:b w:val="0"/>
+          <w:i w:val="0"/>
+          <w:sz w:val="21"/>
+        </w:rPr>
+        <w:t>正式综述不建议直接从关键词搜索开始。先把中英文检索式、目标条数和纳入/排除标准写入项目,再执行检索,可以避免看到结果后临时改变标准。没有可用模型时,计划仍会生成模板骨架,但不会假装已经完成领域同义词扩展。</w:t>
+      </w:r>
+    </w:p>
+    <w:tbl>
+      <w:tblPr>
+        <w:tblW w:type="auto" w:w="0"/>
+        <w:jc w:val="center"/>
+        <w:tblLook w:firstColumn="1" w:firstRow="1" w:lastColumn="0" w:lastRow="0" w:noHBand="0" w:noVBand="1" w:val="04A0"/>
+      </w:tblPr>
+      <w:tblGrid>
+        <w:gridCol w:w="9066"/>
+      </w:tblGrid>
+      <w:tr>
+        <w:tc>
+          <w:tcPr>
+            <w:tcW w:type="dxa" w:w="9066"/>
+            <w:shd w:val="clear" w:fill="EAF1F8"/>
+          </w:tcPr>
+          <w:p>
+            <w:pPr>
+              <w:spacing w:after="40"/>
+            </w:pPr>
+            <w:r/>
+            <w:r>
+              <w:rPr>
+                <w:rFonts w:ascii="Arial Unicode MS" w:hAnsi="Arial Unicode MS" w:eastAsia="Arial Unicode MS" w:cs="Arial Unicode MS" w:hint="eastAsia"/>
+                <w:b/>
+                <w:color w:val="1F4E79"/>
+                <w:sz w:val="20"/>
+              </w:rPr>
+              <w:t>对话示例</w:t>
+            </w:r>
+          </w:p>
+          <w:p>
+            <w:pPr>
+              <w:spacing w:after="20"/>
+            </w:pPr>
+            <w:r>
+              <w:rPr>
+                <w:rFonts w:ascii="Arial Unicode MS" w:hAnsi="Arial Unicode MS" w:eastAsia="Arial Unicode MS" w:cs="Arial Unicode MS" w:hint="eastAsia"/>
+                <w:sz w:val="19"/>
+              </w:rPr>
+              <w:t>「先为正念训练与考试焦虑生成中英文检索式和纳入排除标准」</w:t>
+            </w:r>
+          </w:p>
+          <w:p>
+            <w:pPr>
+              <w:spacing w:after="20"/>
+            </w:pPr>
+            <w:r>
+              <w:rPr>
+                <w:rFonts w:ascii="Arial Unicode MS" w:hAnsi="Arial Unicode MS" w:eastAsia="Arial Unicode MS" w:cs="Arial Unicode MS" w:hint="eastAsia"/>
+                <w:sz w:val="19"/>
+              </w:rPr>
+              <w:t>「把检索计划写进 notes,我先人工确认标准」</w:t>
+            </w:r>
+          </w:p>
+        </w:tc>
+      </w:tr>
+    </w:tbl>
+    <w:p>
+      <w:pPr>
+        <w:spacing w:after="80"/>
+      </w:pPr>
+    </w:p>
+    <w:tbl>
+      <w:tblPr>
+        <w:tblW w:type="auto" w:w="0"/>
+        <w:tblLook w:firstColumn="1" w:firstRow="1" w:lastColumn="0" w:lastRow="0" w:noHBand="0" w:noVBand="1" w:val="04A0"/>
+      </w:tblPr>
+      <w:tblGrid>
+        <w:gridCol w:w="9066"/>
+      </w:tblGrid>
+      <w:tr>
+        <w:tc>
+          <w:tcPr>
+            <w:tcW w:type="dxa" w:w="9066"/>
+            <w:shd w:val="clear" w:fill="F2F2F2"/>
+          </w:tcPr>
+          <w:p>
+            <w:pPr>
+              <w:spacing w:after="0" w:line="276" w:lineRule="auto"/>
+            </w:pPr>
+            <w:r/>
+            <w:r>
+              <w:rPr>
+                <w:rFonts w:ascii="Menlo" w:hAnsi="Menlo"/>
+                <w:color w:val="444444"/>
+                <w:sz w:val="18"/>
+              </w:rPr>
+              <w:t>psyclaw lit "正念训练对大学生考试焦虑的干预效果" --plan</w:t>
+            </w:r>
+          </w:p>
+        </w:tc>
+      </w:tr>
+    </w:tbl>
+    <w:p>
+      <w:pPr>
+        <w:spacing w:after="80"/>
+      </w:pPr>
+    </w:p>
+    <w:p>
+      <w:pPr>
+        <w:spacing w:after="120" w:line="360" w:lineRule="auto"/>
+      </w:pPr>
+      <w:r>
+        <w:rPr>
+          <w:rFonts w:ascii="Arial Unicode MS" w:hAnsi="Arial Unicode MS" w:eastAsia="Arial Unicode MS" w:cs="Arial Unicode MS" w:hint="eastAsia"/>
+          <w:b w:val="0"/>
+          <w:i w:val="0"/>
+          <w:sz w:val="21"/>
+        </w:rPr>
+        <w:t>主要产物是 notes/search_plan.md 与 notes/screening_criteria.json。前者包含公开 API和机构库的操作路线,后者是筛选标准的机器可读真源。标准确认后,再进入正式检索。</w:t>
+      </w:r>
+    </w:p>
+    <w:p>
+      <w:pPr>
+        <w:pStyle w:val="Heading2"/>
+        <w:spacing w:before="240" w:after="160"/>
+      </w:pPr>
+      <w:r>
+        <w:rPr>
+          <w:rFonts w:ascii="Arial Unicode MS" w:hAnsi="Arial Unicode MS" w:eastAsia="Arial Unicode MS" w:cs="Arial Unicode MS" w:hint="eastAsia"/>
+          <w:b/>
+          <w:color w:val="1A1A1A"/>
+          <w:sz w:val="28"/>
+        </w:rPr>
+        <w:t>2.5　多源检索、去重与 PRISMA 记录</w:t>
+      </w:r>
+    </w:p>
+    <w:p>
+      <w:pPr>
+        <w:spacing w:after="120" w:line="360" w:lineRule="auto"/>
+      </w:pPr>
+      <w:r>
+        <w:rPr>
+          <w:rFonts w:ascii="Arial Unicode MS" w:hAnsi="Arial Unicode MS" w:eastAsia="Arial Unicode MS" w:cs="Arial Unicode MS" w:hint="eastAsia"/>
+          <w:b w:val="0"/>
+          <w:i w:val="0"/>
+          <w:sz w:val="21"/>
+        </w:rPr>
+        <w:t>公开检索核支持 OpenAlex、Crossref、Europe PMC、arXiv 和 Semantic Scholar。各来源被归一为同一题录格式,保留标题、作者、年份、DOI、摘要、来源、OA 状态和全文链接。系统优先按 DOI 去重,没有 DOI 时再按规范化标题去重,并记录原始命中、去重后命中、重复数和分来源计数。</w:t>
+      </w:r>
+    </w:p>
+    <w:tbl>
+      <w:tblPr>
+        <w:tblW w:type="auto" w:w="0"/>
+        <w:tblLook w:firstColumn="1" w:firstRow="1" w:lastColumn="0" w:lastRow="0" w:noHBand="0" w:noVBand="1" w:val="04A0"/>
+      </w:tblPr>
+      <w:tblGrid>
+        <w:gridCol w:w="9066"/>
+      </w:tblGrid>
+      <w:tr>
+        <w:tc>
+          <w:tcPr>
+            <w:tcW w:type="dxa" w:w="9066"/>
+            <w:shd w:val="clear" w:fill="F2F2F2"/>
+          </w:tcPr>
+          <w:p>
+            <w:pPr>
+              <w:spacing w:after="0" w:line="276" w:lineRule="auto"/>
+            </w:pPr>
+            <w:r/>
+            <w:r>
+              <w:rPr>
+                <w:rFonts w:ascii="Menlo" w:hAnsi="Menlo"/>
+                <w:color w:val="444444"/>
+                <w:sz w:val="18"/>
+              </w:rPr>
+              <w:t>psyclaw lit "正念训练对大学生考试焦虑的干预效果" --sources openalex,crossref,europepmc --limit 10</w:t>
+            </w:r>
+          </w:p>
+        </w:tc>
+      </w:tr>
+    </w:tbl>
+    <w:p>
+      <w:pPr>
+        <w:spacing w:after="80"/>
+      </w:pPr>
+    </w:p>
+    <w:p>
+      <w:pPr>
+        <w:spacing w:after="120" w:line="360" w:lineRule="auto"/>
+      </w:pPr>
+      <w:r>
+        <w:rPr>
+          <w:rFonts w:ascii="Arial Unicode MS" w:hAnsi="Arial Unicode MS" w:eastAsia="Arial Unicode MS" w:cs="Arial Unicode MS" w:hint="eastAsia"/>
+          <w:b w:val="0"/>
+          <w:i w:val="0"/>
+          <w:sz w:val="21"/>
+        </w:rPr>
+        <w:t>检索结束后检查 notes/lit_search.json 与 notes/prisma_search.md。中文主题覆盖不足时,可显式启用 WebBridge 访问用户已登录的知网、万方或维普,也可以把人工导出的结果回灌:psyclaw lit --import &lt;文件&gt;。桥接失败不会伪造结果,而是保留公开 API 结果并提示下一步。</w:t>
+      </w:r>
+    </w:p>
+    <w:p>
+      <w:pPr>
+        <w:pStyle w:val="Heading2"/>
+        <w:spacing w:before="240" w:after="160"/>
+      </w:pPr>
+      <w:r>
+        <w:rPr>
+          <w:rFonts w:ascii="Arial Unicode MS" w:hAnsi="Arial Unicode MS" w:eastAsia="Arial Unicode MS" w:cs="Arial Unicode MS" w:hint="eastAsia"/>
+          <w:b/>
+          <w:color w:val="1A1A1A"/>
+          <w:sz w:val="28"/>
+        </w:rPr>
+        <w:t>2.6　筛选、全文与文献矩阵</w:t>
+      </w:r>
+    </w:p>
+    <w:p>
+      <w:pPr>
+        <w:spacing w:after="120" w:line="360" w:lineRule="auto"/>
+      </w:pPr>
+      <w:r>
+        <w:rPr>
+          <w:rFonts w:ascii="Arial Unicode MS" w:hAnsi="Arial Unicode MS" w:eastAsia="Arial Unicode MS" w:cs="Arial Unicode MS" w:hint="eastAsia"/>
+          <w:b w:val="0"/>
+          <w:i w:val="0"/>
+          <w:sz w:val="21"/>
+        </w:rPr>
+        <w:t>正式 literature 流程会对标题和摘要做确定性相关性初筛,并写入 notes/prisma_flow.md。这一步是候选排序和人工复核起点,不是语义精筛,也不是研究质量评价。纳入文献的全文按 Europe PMC OA XML、Unpaywall、arXiv、明确 OA 链接和机构权限顺序获取;付费墙不会被绕过。</w:t>
+      </w:r>
+    </w:p>
+    <w:tbl>
+      <w:tblPr>
+        <w:tblW w:type="auto" w:w="0"/>
+        <w:jc w:val="center"/>
+        <w:tblLook w:firstColumn="1" w:firstRow="1" w:lastColumn="0" w:lastRow="0" w:noHBand="0" w:noVBand="1" w:val="04A0"/>
+      </w:tblPr>
+      <w:tblGrid>
+        <w:gridCol w:w="9066"/>
+      </w:tblGrid>
+      <w:tr>
+        <w:tc>
+          <w:tcPr>
+            <w:tcW w:type="dxa" w:w="9066"/>
+            <w:shd w:val="clear" w:fill="EAF1F8"/>
+          </w:tcPr>
+          <w:p>
+            <w:pPr>
+              <w:spacing w:after="40"/>
+            </w:pPr>
+            <w:r/>
+            <w:r>
+              <w:rPr>
+                <w:rFonts w:ascii="Arial Unicode MS" w:hAnsi="Arial Unicode MS" w:eastAsia="Arial Unicode MS" w:cs="Arial Unicode MS" w:hint="eastAsia"/>
+                <w:b/>
+                <w:color w:val="1F4E79"/>
+                <w:sz w:val="20"/>
+              </w:rPr>
+              <w:t>对话示例</w:t>
+            </w:r>
+          </w:p>
+          <w:p>
+            <w:pPr>
+              <w:spacing w:after="20"/>
+            </w:pPr>
+            <w:r>
+              <w:rPr>
+                <w:rFonts w:ascii="Arial Unicode MS" w:hAnsi="Arial Unicode MS" w:eastAsia="Arial Unicode MS" w:cs="Arial Unicode MS" w:hint="eastAsia"/>
+                <w:sz w:val="19"/>
+              </w:rPr>
+              <w:t>「把纳入候选生成文献矩阵,没有全文的内容全部标待核查」</w:t>
+            </w:r>
+          </w:p>
+          <w:p>
+            <w:pPr>
+              <w:spacing w:after="20"/>
+            </w:pPr>
+            <w:r>
+              <w:rPr>
+                <w:rFonts w:ascii="Arial Unicode MS" w:hAnsi="Arial Unicode MS" w:eastAsia="Arial Unicode MS" w:cs="Arial Unicode MS" w:hint="eastAsia"/>
+                <w:sz w:val="19"/>
+              </w:rPr>
+              <w:t>「把开放获取的文献下载到项目里,并记录文件 hash」</w:t>
+            </w:r>
+          </w:p>
+        </w:tc>
+      </w:tr>
+    </w:tbl>
+    <w:p>
+      <w:pPr>
+        <w:spacing w:after="80"/>
+      </w:pPr>
+    </w:p>
+    <w:tbl>
+      <w:tblPr>
+        <w:tblW w:type="auto" w:w="0"/>
+        <w:tblLook w:firstColumn="1" w:firstRow="1" w:lastColumn="0" w:lastRow="0" w:noHBand="0" w:noVBand="1" w:val="04A0"/>
+      </w:tblPr>
+      <w:tblGrid>
+        <w:gridCol w:w="9066"/>
+      </w:tblGrid>
+      <w:tr>
+        <w:tc>
+          <w:tcPr>
+            <w:tcW w:type="dxa" w:w="9066"/>
+            <w:shd w:val="clear" w:fill="F2F2F2"/>
+          </w:tcPr>
+          <w:p>
+            <w:pPr>
+              <w:spacing w:after="0" w:line="276" w:lineRule="auto"/>
+            </w:pPr>
+            <w:r/>
+            <w:r>
+              <w:rPr>
+                <w:rFonts w:ascii="Menlo" w:hAnsi="Menlo"/>
+                <w:color w:val="444444"/>
+                <w:sz w:val="18"/>
+              </w:rPr>
+              <w:t>psyclaw lit --matrix "正念训练对大学生考试焦虑的干预效果"</w:t>
+            </w:r>
+          </w:p>
+          <w:p>
+            <w:pPr>
+              <w:spacing w:after="0" w:line="276" w:lineRule="auto"/>
+            </w:pPr>
+            <w:r>
+              <w:rPr>
+                <w:rFonts w:ascii="Menlo" w:hAnsi="Menlo"/>
+                <w:color w:val="444444"/>
+                <w:sz w:val="18"/>
+              </w:rPr>
+              <w:t>psyclaw lit "正念训练对大学生考试焦虑的干预效果" --download</w:t>
+            </w:r>
+          </w:p>
+        </w:tc>
+      </w:tr>
+    </w:tbl>
+    <w:p>
+      <w:pPr>
+        <w:spacing w:after="80"/>
+      </w:pPr>
+    </w:p>
+    <w:p>
+      <w:pPr>
+        <w:spacing w:after="120" w:line="360" w:lineRule="auto"/>
+      </w:pPr>
+      <w:r>
+        <w:rPr>
+          <w:rFonts w:ascii="Arial Unicode MS" w:hAnsi="Arial Unicode MS" w:eastAsia="Arial Unicode MS" w:cs="Arial Unicode MS" w:hint="eastAsia"/>
+          <w:b w:val="0"/>
+          <w:i w:val="0"/>
+          <w:sz w:val="21"/>
+        </w:rPr>
+        <w:t>矩阵产物为 notes/lit_matrix.md 和 notes/evidence_map.json。未知研究对象、方法、发现和局限不会由系统猜测,而会标注「待核查」或「全文未获取」。PDF 下载会检查文件魔数、规范命名和 SHA-256,审计记录位于 outputs/pdfs/pdf_audit.json。</w:t>
+      </w:r>
+    </w:p>
+    <w:p>
+      <w:pPr>
+        <w:pStyle w:val="Heading2"/>
+        <w:spacing w:before="240" w:after="160"/>
+      </w:pPr>
+      <w:r>
+        <w:rPr>
+          <w:rFonts w:ascii="Arial Unicode MS" w:hAnsi="Arial Unicode MS" w:eastAsia="Arial Unicode MS" w:cs="Arial Unicode MS" w:hint="eastAsia"/>
+          <w:b/>
+          <w:color w:val="1A1A1A"/>
+          <w:sz w:val="28"/>
+        </w:rPr>
+        <w:t>2.7　Evidence Map 与有据综述</w:t>
+      </w:r>
+    </w:p>
+    <w:p>
+      <w:pPr>
+        <w:spacing w:after="120" w:line="360" w:lineRule="auto"/>
+      </w:pPr>
+      <w:r>
+        <w:rPr>
+          <w:rFonts w:ascii="Arial Unicode MS" w:hAnsi="Arial Unicode MS" w:eastAsia="Arial Unicode MS" w:cs="Arial Unicode MS" w:hint="eastAsia"/>
+          <w:b w:val="0"/>
+          <w:i w:val="0"/>
+          <w:sz w:val="21"/>
+        </w:rPr>
+        <w:t>Evidence Map 是检索结果和自然语言综述之间的机器可读中间层。它为每篇文献生成可消歧的 citation key,记录年份范围、OA 数量、重复主题词以及主题到支持文献的映射。配置了真实 Provider 且有检索命中时,模型只能使用 Evidence Map 中的引用键和摘要片段;没有 Provider、没有命中或模型调用失败时,系统生成明确标注的确定性骨架。</w:t>
+      </w:r>
+    </w:p>
+    <w:p>
+      <w:pPr>
+        <w:spacing w:after="120" w:line="360" w:lineRule="auto"/>
+      </w:pPr>
+      <w:r>
+        <w:rPr>
+          <w:rFonts w:ascii="Arial Unicode MS" w:hAnsi="Arial Unicode MS" w:eastAsia="Arial Unicode MS" w:cs="Arial Unicode MS" w:hint="eastAsia"/>
+          <w:b w:val="0"/>
+          <w:i w:val="0"/>
+          <w:sz w:val="21"/>
+        </w:rPr>
+        <w:t>无模型时不会默认降级为 MockProvider。确定性骨架是可追溯的内部产物,不能当作正式的模型综述或真实环境验收证据。</w:t>
+      </w:r>
+    </w:p>
+    <w:tbl>
+      <w:tblPr>
+        <w:tblW w:type="auto" w:w="0"/>
+        <w:tblLook w:firstColumn="1" w:firstRow="1" w:lastColumn="0" w:lastRow="0" w:noHBand="0" w:noVBand="1" w:val="04A0"/>
+      </w:tblPr>
+      <w:tblGrid>
+        <w:gridCol w:w="9066"/>
+      </w:tblGrid>
+      <w:tr>
+        <w:tc>
+          <w:tcPr>
+            <w:tcW w:type="dxa" w:w="9066"/>
+            <w:shd w:val="clear" w:fill="F2F2F2"/>
+          </w:tcPr>
+          <w:p>
+            <w:pPr>
+              <w:spacing w:after="0" w:line="276" w:lineRule="auto"/>
+            </w:pPr>
+            <w:r/>
+            <w:r>
+              <w:rPr>
+                <w:rFonts w:ascii="Menlo" w:hAnsi="Menlo"/>
+                <w:color w:val="444444"/>
+                <w:sz w:val="18"/>
+              </w:rPr>
+              <w:t>psyclaw lit "正念训练对大学生考试焦虑的干预效果" --synthesize</w:t>
+            </w:r>
+          </w:p>
+        </w:tc>
+      </w:tr>
+    </w:tbl>
+    <w:p>
+      <w:pPr>
+        <w:spacing w:after="80"/>
+      </w:pPr>
+    </w:p>
+    <w:p>
+      <w:pPr>
+        <w:pStyle w:val="Heading2"/>
+        <w:spacing w:before="240" w:after="160"/>
+      </w:pPr>
+      <w:r>
+        <w:rPr>
+          <w:rFonts w:ascii="Arial Unicode MS" w:hAnsi="Arial Unicode MS" w:eastAsia="Arial Unicode MS" w:cs="Arial Unicode MS" w:hint="eastAsia"/>
+          <w:b/>
+          <w:color w:val="1A1A1A"/>
+          <w:sz w:val="28"/>
+        </w:rPr>
+        <w:t>2.8　引用核验与流程验收</w:t>
+      </w:r>
+    </w:p>
+    <w:p>
+      <w:pPr>
+        <w:spacing w:after="120" w:line="360" w:lineRule="auto"/>
+      </w:pPr>
+      <w:r>
+        <w:rPr>
+          <w:rFonts w:ascii="Arial Unicode MS" w:hAnsi="Arial Unicode MS" w:eastAsia="Arial Unicode MS" w:cs="Arial Unicode MS" w:hint="eastAsia"/>
+          <w:b w:val="0"/>
+          <w:i w:val="0"/>
+          <w:sz w:val="21"/>
+        </w:rPr>
+        <w:t>引用核验优先读取 notes/evidence_map.json,回落到 notes/lit_search.json,按首位作者姓氏和年份检查文内引用是否来自真实检索语料,并双向检查参考文献表。结果写入notes/citation_audit.json 与 notes/citation_audit.md;没有语料或格式特殊时明确标记人工核验。</w:t>
+      </w:r>
+    </w:p>
+    <w:p>
+      <w:pPr>
+        <w:spacing w:after="120" w:line="360" w:lineRule="auto"/>
+      </w:pPr>
+      <w:r>
+        <w:rPr>
+          <w:rFonts w:ascii="Arial Unicode MS" w:hAnsi="Arial Unicode MS" w:eastAsia="Arial Unicode MS" w:cs="Arial Unicode MS" w:hint="eastAsia"/>
+          <w:b w:val="0"/>
+          <w:i w:val="0"/>
+          <w:sz w:val="21"/>
+        </w:rPr>
+        <w:t>完整流程的入口是 psyclaw run literature。正式运行先检查研究准备 gate,每一步写检查点,最后生成 notes/workflow_summary.json。缺少 Provider 或 API key 会明确失败;--exploratory 只能由用户显式选择,跳过的 gate 会写入 notes/gate_skips.md。流程中断后可用 --resume 继续,不会把终端的一句「完成」当成唯一证据。</w:t>
+      </w:r>
+    </w:p>
+    <w:tbl>
+      <w:tblPr>
+        <w:tblW w:type="auto" w:w="0"/>
+        <w:tblLook w:firstColumn="1" w:firstRow="1" w:lastColumn="0" w:lastRow="0" w:noHBand="0" w:noVBand="1" w:val="04A0"/>
+      </w:tblPr>
+      <w:tblGrid>
+        <w:gridCol w:w="9066"/>
+      </w:tblGrid>
+      <w:tr>
+        <w:tc>
+          <w:tcPr>
+            <w:tcW w:type="dxa" w:w="9066"/>
+            <w:shd w:val="clear" w:fill="F2F2F2"/>
+          </w:tcPr>
+          <w:p>
+            <w:pPr>
+              <w:spacing w:after="0" w:line="276" w:lineRule="auto"/>
+            </w:pPr>
+            <w:r/>
+            <w:r>
+              <w:rPr>
+                <w:rFonts w:ascii="Menlo" w:hAnsi="Menlo"/>
+                <w:color w:val="444444"/>
+                <w:sz w:val="18"/>
+              </w:rPr>
+              <w:t>psyclaw run literature "正念训练对大学生考试焦虑的干预效果"</w:t>
+            </w:r>
+          </w:p>
+          <w:p>
+            <w:pPr>
+              <w:spacing w:after="0" w:line="276" w:lineRule="auto"/>
+            </w:pPr>
+            <w:r>
+              <w:rPr>
+                <w:rFonts w:ascii="Menlo" w:hAnsi="Menlo"/>
+                <w:color w:val="444444"/>
+                <w:sz w:val="18"/>
+              </w:rPr>
+              <w:t>psyclaw run literature "正念训练对大学生考试焦虑的干预效果" --resume</w:t>
+            </w:r>
+          </w:p>
+        </w:tc>
+      </w:tr>
+    </w:tbl>
+    <w:p>
+      <w:pPr>
+        <w:spacing w:after="80"/>
+      </w:pPr>
+    </w:p>
+    <w:tbl>
+      <w:tblPr>
+        <w:tblW w:type="auto" w:w="0"/>
+        <w:jc w:val="center"/>
+        <w:tblLook w:firstColumn="1" w:firstRow="1" w:lastColumn="0" w:lastRow="0" w:noHBand="0" w:noVBand="1" w:val="04A0"/>
+      </w:tblPr>
+      <w:tblGrid>
+        <w:gridCol w:w="9066"/>
+      </w:tblGrid>
+      <w:tr>
+        <w:tc>
+          <w:tcPr>
+            <w:tcW w:type="dxa" w:w="9066"/>
+            <w:shd w:val="clear" w:fill="FBF3E2"/>
+          </w:tcPr>
+          <w:p>
+            <w:pPr>
+              <w:spacing w:after="40"/>
+            </w:pPr>
+            <w:r/>
+            <w:r>
+              <w:rPr>
+                <w:rFonts w:ascii="Arial Unicode MS" w:hAnsi="Arial Unicode MS" w:eastAsia="Arial Unicode MS" w:cs="Arial Unicode MS" w:hint="eastAsia"/>
+                <w:b/>
+                <w:color w:val="8A5A00"/>
+                <w:sz w:val="20"/>
+              </w:rPr>
+              <w:t>文献模块当前状态</w:t>
+            </w:r>
+          </w:p>
+          <w:p>
+            <w:pPr>
+              <w:spacing w:after="20"/>
+            </w:pPr>
+            <w:r>
+              <w:rPr>
+                <w:rFonts w:ascii="Arial Unicode MS" w:hAnsi="Arial Unicode MS" w:eastAsia="Arial Unicode MS" w:cs="Arial Unicode MS" w:hint="eastAsia"/>
+                <w:sz w:val="19"/>
+              </w:rPr>
+              <w:t>代码与离线自动化测试已覆盖: workflow、检索、初筛、合成、矩阵、桥接、付费墙、引用和 Zotero。</w:t>
+            </w:r>
+          </w:p>
+          <w:p>
+            <w:pPr>
+              <w:spacing w:after="20"/>
+            </w:pPr>
+            <w:r>
+              <w:rPr>
+                <w:rFonts w:ascii="Arial Unicode MS" w:hAnsi="Arial Unicode MS" w:eastAsia="Arial Unicode MS" w:cs="Arial Unicode MS" w:hint="eastAsia"/>
+                <w:sz w:val="19"/>
+              </w:rPr>
+              <w:t>仍需真实验收: Provider 下的完整流程、真实 WebBridge 三库、机构 SSO、Zotero 文库和全文质量。</w:t>
+            </w:r>
+          </w:p>
+          <w:p>
+            <w:pPr>
+              <w:spacing w:after="20"/>
+            </w:pPr>
+            <w:r>
+              <w:rPr>
+                <w:rFonts w:ascii="Arial Unicode MS" w:hAnsi="Arial Unicode MS" w:eastAsia="Arial Unicode MS" w:cs="Arial Unicode MS" w:hint="eastAsia"/>
+                <w:sz w:val="19"/>
+              </w:rPr>
+              <w:t>当前初筛是题录级确定性初筛;review 在 literature workflow 中仍是可选步骤。</w:t>
             </w:r>
           </w:p>
         </w:tc>

</xml_diff>